<commit_message>
isofields pressure and coefficients документация
</commit_message>
<xml_diff>
--- a/документация.docx
+++ b/документация.docx
@@ -26,7 +26,10 @@
     </w:p>
     <w:p>
       <w:r>
-        <w:t>Выбираем ближайшее здание:</w:t>
+        <w:t xml:space="preserve">Выбираем ближайшее </w:t>
+      </w:r>
+      <w:r>
+        <w:t>здание:</w:t>
       </w:r>
       <w:r>
         <w:br/>
@@ -158,7 +161,22 @@
       </w:r>
       <w:proofErr w:type="spellEnd"/>
       <w:r>
-        <w:t xml:space="preserve"> масштаба по ширине) - делим реальную ширину на ширину найденной ближайшем модели из </w:t>
+        <w:t xml:space="preserve"> масштаба по ширине) - </w:t>
+      </w:r>
+      <w:r>
+        <w:t xml:space="preserve">делим реальную </w:t>
+      </w:r>
+      <w:r>
+        <w:t>ширину</w:t>
+      </w:r>
+      <w:r>
+        <w:t xml:space="preserve"> на </w:t>
+      </w:r>
+      <w:r>
+        <w:t xml:space="preserve">ширину найденной ближайшем модели </w:t>
+      </w:r>
+      <w:r>
+        <w:t xml:space="preserve">из </w:t>
       </w:r>
       <w:proofErr w:type="spellStart"/>
       <w:r>
@@ -174,7 +192,13 @@
         <w:rPr>
           <w:lang w:val="en-US"/>
         </w:rPr>
-        <w:t>Ky</w:t>
+        <w:t>K</w:t>
+      </w:r>
+      <w:r>
+        <w:rPr>
+          <w:lang w:val="en-US"/>
+        </w:rPr>
+        <w:t>y</w:t>
       </w:r>
       <w:r>
         <w:t xml:space="preserve"> (</w:t>
@@ -185,7 +209,25 @@
       </w:r>
       <w:proofErr w:type="spellEnd"/>
       <w:r>
-        <w:t xml:space="preserve"> масштаба по глубине) - делим реальную глубину на глубину найденной ближайшем модели из </w:t>
+        <w:t xml:space="preserve"> масштаба по </w:t>
+      </w:r>
+      <w:r>
+        <w:t>глубине</w:t>
+      </w:r>
+      <w:r>
+        <w:t xml:space="preserve">) - делим реальную </w:t>
+      </w:r>
+      <w:r>
+        <w:t>глубину</w:t>
+      </w:r>
+      <w:r>
+        <w:t xml:space="preserve"> на </w:t>
+      </w:r>
+      <w:r>
+        <w:t xml:space="preserve">глубину </w:t>
+      </w:r>
+      <w:r>
+        <w:t xml:space="preserve">найденной ближайшем модели из </w:t>
       </w:r>
       <w:proofErr w:type="spellStart"/>
       <w:r>
@@ -587,7 +629,6 @@
         <w:t xml:space="preserve">Дальше умножаем на </w:t>
       </w:r>
       <w:proofErr w:type="spellStart"/>
-      <w:proofErr w:type="gramStart"/>
       <w:r>
         <w:rPr>
           <w:lang w:val="en-US"/>
@@ -596,11 +637,7 @@
       </w:r>
       <w:proofErr w:type="spellEnd"/>
       <w:r>
-        <w:t>(</w:t>
-      </w:r>
-      <w:proofErr w:type="gramEnd"/>
-      <w:r>
-        <w:t>чтобы перейти к реальному масштабу)</w:t>
+        <w:t>(чтобы перейти к реальному масштабу)</w:t>
       </w:r>
     </w:p>
     <w:p>
@@ -792,7 +829,6 @@
         <w:t>*</w:t>
       </w:r>
       <w:proofErr w:type="spellStart"/>
-      <w:proofErr w:type="gramStart"/>
       <w:r>
         <w:rPr>
           <w:lang w:val="en-US"/>
@@ -803,7 +839,6 @@
       <w:r>
         <w:t>)=</w:t>
       </w:r>
-      <w:proofErr w:type="gramEnd"/>
       <w:r>
         <w:rPr>
           <w:lang w:val="en-US"/>
@@ -991,15 +1026,7 @@
       </w:r>
       <w:proofErr w:type="spellEnd"/>
       <w:r>
-        <w:t xml:space="preserve"> не на </w:t>
-      </w:r>
-      <w:proofErr w:type="gramStart"/>
-      <w:r>
-        <w:t>константу</w:t>
-      </w:r>
-      <w:proofErr w:type="gramEnd"/>
-      <w:r>
-        <w:t xml:space="preserve"> а на каждую высоту для датчиков, так получаем изополя давления</w:t>
+        <w:t xml:space="preserve"> не на константу а на каждую высоту для датчиков, так получаем изополя давления</w:t>
       </w:r>
     </w:p>
     <w:p/>
@@ -1016,35 +1043,7 @@
         <w:t xml:space="preserve"> в полярной не трогаем</w:t>
       </w:r>
     </w:p>
-    <w:p>
-      <w:pPr>
-        <w:rPr>
-          <w:lang w:val="en-US"/>
-        </w:rPr>
-      </w:pPr>
-      <w:proofErr w:type="spellStart"/>
-      <w:r>
-        <w:rPr>
-          <w:lang w:val="en-US"/>
-        </w:rPr>
-        <w:t>src.</w:t>
-      </w:r>
-      <w:proofErr w:type="gramStart"/>
-      <w:r>
-        <w:rPr>
-          <w:lang w:val="en-US"/>
-        </w:rPr>
-        <w:t>ui.view</w:t>
-      </w:r>
-      <w:proofErr w:type="gramEnd"/>
-      <w:r>
-        <w:rPr>
-          <w:lang w:val="en-US"/>
-        </w:rPr>
-        <w:t>.interface.Interface.plot_isofields</w:t>
-      </w:r>
-      <w:proofErr w:type="spellEnd"/>
-    </w:p>
+    <w:p/>
     <w:p>
       <w:pPr>
         <w:rPr>
@@ -1057,462 +1056,50 @@
           <w:b/>
           <w:bCs/>
         </w:rPr>
-        <w:t xml:space="preserve">Аэродинамические </w:t>
-      </w:r>
-      <w:proofErr w:type="spellStart"/>
+        <w:t>Спектры</w:t>
+      </w:r>
       <w:r>
         <w:rPr>
           <w:b/>
           <w:bCs/>
         </w:rPr>
-        <w:t>коэфы</w:t>
-      </w:r>
-      <w:proofErr w:type="spellEnd"/>
-      <w:r>
-        <w:rPr>
-          <w:b/>
-          <w:bCs/>
-        </w:rPr>
-        <w:t xml:space="preserve"> силы</w:t>
-      </w:r>
-    </w:p>
-    <w:p>
-      <w:r>
-        <w:tab/>
-        <w:t xml:space="preserve">Система координат </w:t>
-      </w:r>
-      <w:r>
-        <w:rPr>
-          <w:lang w:val="en-US"/>
-        </w:rPr>
-        <w:t>OX</w:t>
+        <w:br/>
+      </w:r>
+    </w:p>
+    <w:p>
+      <w:r>
+        <w:t xml:space="preserve">Приходит </w:t>
+      </w:r>
+      <w:r>
+        <w:rPr>
+          <w:lang w:val="en-US"/>
+        </w:rPr>
+        <w:t>cx</w:t>
+      </w:r>
+      <w:r>
+        <w:t>\</w:t>
+      </w:r>
+      <w:r>
+        <w:rPr>
+          <w:lang w:val="en-US"/>
+        </w:rPr>
+        <w:t>cy</w:t>
+      </w:r>
+      <w:r>
+        <w:t xml:space="preserve">(любая временная функция) считаем </w:t>
+      </w:r>
+      <w:r>
+        <w:rPr>
+          <w:lang w:val="en-US"/>
+        </w:rPr>
+        <w:t>std</w:t>
+      </w:r>
+      <w:r>
+        <w:t>**2</w:t>
       </w:r>
       <w:r>
         <w:t xml:space="preserve"> </w:t>
       </w:r>
-      <w:r>
-        <w:rPr>
-          <w:lang w:val="en-US"/>
-        </w:rPr>
-        <w:t>OY</w:t>
-      </w:r>
-      <w:r>
-        <w:t xml:space="preserve"> поворачивается вместе со зданием, и поэтому 1 и 3 грани всегда будут соответствовать </w:t>
-      </w:r>
-      <w:r>
-        <w:rPr>
-          <w:lang w:val="en-US"/>
-        </w:rPr>
-        <w:t>cx</w:t>
-      </w:r>
-      <w:r>
-        <w:t>,</w:t>
-      </w:r>
-      <w:r>
-        <w:t xml:space="preserve"> </w:t>
-      </w:r>
-      <w:r>
-        <w:t xml:space="preserve">а 2 и 4 </w:t>
-      </w:r>
-      <w:r>
-        <w:rPr>
-          <w:lang w:val="en-US"/>
-        </w:rPr>
-        <w:t>cy</w:t>
-      </w:r>
-      <w:r>
-        <w:t xml:space="preserve"> </w:t>
-      </w:r>
-      <w:proofErr w:type="spellStart"/>
-      <w:r>
-        <w:t>тк</w:t>
-      </w:r>
-      <w:proofErr w:type="spellEnd"/>
-      <w:r>
-        <w:t xml:space="preserve"> их нормали направлены вдоль соответствующих осей, а общая формула вычисления</w:t>
-      </w:r>
-    </w:p>
-    <w:p>
-      <w:pPr>
-        <w:rPr>
-          <w:lang w:val="en-US"/>
-        </w:rPr>
-      </w:pPr>
-      <w:r>
-        <w:rPr>
-          <w:noProof/>
-        </w:rPr>
-        <w:drawing>
-          <wp:inline distT="0" distB="0" distL="0" distR="0" wp14:anchorId="2938C4DF" wp14:editId="2DE74EF3">
-            <wp:extent cx="2914919" cy="1639584"/>
-            <wp:effectExtent l="0" t="0" r="0" b="0"/>
-            <wp:docPr id="1" name="Рисунок 1"/>
-            <wp:cNvGraphicFramePr>
-              <a:graphicFrameLocks xmlns:a="http://schemas.openxmlformats.org/drawingml/2006/main" noChangeAspect="1"/>
-            </wp:cNvGraphicFramePr>
-            <a:graphic xmlns:a="http://schemas.openxmlformats.org/drawingml/2006/main">
-              <a:graphicData uri="http://schemas.openxmlformats.org/drawingml/2006/picture">
-                <pic:pic xmlns:pic="http://schemas.openxmlformats.org/drawingml/2006/picture">
-                  <pic:nvPicPr>
-                    <pic:cNvPr id="1" name=""/>
-                    <pic:cNvPicPr/>
-                  </pic:nvPicPr>
-                  <pic:blipFill>
-                    <a:blip r:embed="rId5"/>
-                    <a:stretch>
-                      <a:fillRect/>
-                    </a:stretch>
-                  </pic:blipFill>
-                  <pic:spPr>
-                    <a:xfrm>
-                      <a:off x="0" y="0"/>
-                      <a:ext cx="2922776" cy="1644003"/>
-                    </a:xfrm>
-                    <a:prstGeom prst="rect">
-                      <a:avLst/>
-                    </a:prstGeom>
-                  </pic:spPr>
-                </pic:pic>
-              </a:graphicData>
-            </a:graphic>
-          </wp:inline>
-        </w:drawing>
-      </w:r>
-    </w:p>
-    <w:p>
-      <w:r>
-        <w:t xml:space="preserve">Для каждого временного отсчета </w:t>
-      </w:r>
-      <w:proofErr w:type="spellStart"/>
-      <w:r>
-        <w:rPr>
-          <w:lang w:val="en-US"/>
-        </w:rPr>
-        <w:t>ti</w:t>
-      </w:r>
-      <w:proofErr w:type="spellEnd"/>
-      <w:r>
-        <w:t xml:space="preserve"> суммарные </w:t>
-      </w:r>
-      <w:proofErr w:type="spellStart"/>
-      <w:r>
-        <w:t>аэро</w:t>
-      </w:r>
-      <w:proofErr w:type="spellEnd"/>
-      <w:r>
-        <w:t xml:space="preserve"> </w:t>
-      </w:r>
-      <w:proofErr w:type="spellStart"/>
-      <w:r>
-        <w:t>коэф</w:t>
-      </w:r>
-      <w:proofErr w:type="spellEnd"/>
-      <w:r>
-        <w:t xml:space="preserve"> силы</w:t>
-      </w:r>
-    </w:p>
-    <w:p>
-      <w:proofErr w:type="spellStart"/>
-      <w:r>
-        <w:rPr>
-          <w:lang w:val="en-US"/>
-        </w:rPr>
-        <w:t>Cx</w:t>
-      </w:r>
-      <w:proofErr w:type="spellEnd"/>
-      <w:r>
-        <w:t xml:space="preserve"> вычисляется как сумма </w:t>
-      </w:r>
-      <w:proofErr w:type="spellStart"/>
-      <w:r>
-        <w:t>аэро</w:t>
-      </w:r>
-      <w:proofErr w:type="spellEnd"/>
-      <w:r>
-        <w:t xml:space="preserve"> </w:t>
-      </w:r>
-      <w:proofErr w:type="spellStart"/>
-      <w:r>
-        <w:t>коэф</w:t>
-      </w:r>
-      <w:proofErr w:type="spellEnd"/>
-      <w:r>
-        <w:t xml:space="preserve"> давления на </w:t>
-      </w:r>
-      <w:r>
-        <w:t>соответствующих</w:t>
-      </w:r>
-      <w:r>
-        <w:t xml:space="preserve"> </w:t>
-      </w:r>
-      <w:proofErr w:type="gramStart"/>
-      <w:r>
-        <w:t>гранях(</w:t>
-      </w:r>
-      <w:proofErr w:type="gramEnd"/>
-      <w:r>
-        <w:t xml:space="preserve">1 и 3 </w:t>
-      </w:r>
-      <w:r>
-        <w:rPr>
-          <w:lang w:val="en-US"/>
-        </w:rPr>
-        <w:t>cx</w:t>
-      </w:r>
-      <w:r>
-        <w:t>,</w:t>
-      </w:r>
-      <w:r>
-        <w:t xml:space="preserve"> 2</w:t>
-      </w:r>
-      <w:r>
-        <w:t xml:space="preserve"> и</w:t>
-      </w:r>
-      <w:r>
-        <w:t xml:space="preserve"> 4 </w:t>
-      </w:r>
-      <w:r>
-        <w:rPr>
-          <w:lang w:val="en-US"/>
-        </w:rPr>
-        <w:t>cy</w:t>
-      </w:r>
-      <w:r>
-        <w:t>) умножается на площадь влияния датчика</w:t>
-      </w:r>
-      <w:r>
-        <w:t>(значение каждого датчика умножается на площадь влияния этого датчика)</w:t>
-      </w:r>
-      <w:r>
-        <w:t xml:space="preserve"> и делится на площадь </w:t>
-      </w:r>
-      <w:r>
-        <w:t>соответствующих</w:t>
-      </w:r>
-      <w:r>
-        <w:t xml:space="preserve"> грани</w:t>
-      </w:r>
-    </w:p>
-    <w:p>
-      <w:r>
-        <w:t>***картинку что такое площадь влияния датчика***</w:t>
-      </w:r>
-    </w:p>
-    <w:p/>
-    <w:p>
-      <w:r>
-        <w:t xml:space="preserve">Изначально время это 32.768 секунды в масштабе аэротрубы </w:t>
-      </w:r>
-      <w:proofErr w:type="gramStart"/>
-      <w:r>
-        <w:t>ТПУ</w:t>
-      </w:r>
-      <w:r>
-        <w:t>(</w:t>
-      </w:r>
-      <w:proofErr w:type="gramEnd"/>
-      <w:r>
-        <w:t>масштаб 1\400)</w:t>
-      </w:r>
-    </w:p>
-    <w:p>
-      <w:r>
-        <w:t>Необходимо отмасштабировать время</w:t>
-      </w:r>
-      <w:r>
-        <w:t xml:space="preserve"> </w:t>
-      </w:r>
-      <w:r>
-        <w:t xml:space="preserve">для этого определим </w:t>
-      </w:r>
-      <w:proofErr w:type="spellStart"/>
-      <w:r>
-        <w:t>коэф</w:t>
-      </w:r>
-      <w:proofErr w:type="spellEnd"/>
-      <w:r>
-        <w:t xml:space="preserve"> </w:t>
-      </w:r>
-      <w:r>
-        <w:rPr>
-          <w:lang w:val="en-US"/>
-        </w:rPr>
-        <w:t>kt</w:t>
-      </w:r>
-    </w:p>
-    <w:p>
-      <w:r>
-        <w:rPr>
-          <w:lang w:val="en-US"/>
-        </w:rPr>
-        <w:t>Kt</w:t>
-      </w:r>
-      <w:r>
-        <w:t xml:space="preserve"> = </w:t>
-      </w:r>
-      <w:proofErr w:type="spellStart"/>
-      <w:r>
-        <w:rPr>
-          <w:lang w:val="en-US"/>
-        </w:rPr>
-        <w:t>kv</w:t>
-      </w:r>
-      <w:proofErr w:type="spellEnd"/>
-      <w:r>
-        <w:t>\</w:t>
-      </w:r>
-      <w:r>
-        <w:rPr>
-          <w:lang w:val="en-US"/>
-        </w:rPr>
-        <w:t>kl</w:t>
-      </w:r>
-    </w:p>
-    <w:p>
-      <w:r>
-        <w:t xml:space="preserve">Где </w:t>
-      </w:r>
-      <w:proofErr w:type="spellStart"/>
-      <w:r>
-        <w:rPr>
-          <w:lang w:val="en-US"/>
-        </w:rPr>
-        <w:t>kv</w:t>
-      </w:r>
-      <w:proofErr w:type="spellEnd"/>
-      <w:r>
-        <w:t xml:space="preserve"> </w:t>
-      </w:r>
-      <w:proofErr w:type="spellStart"/>
-      <w:r>
-        <w:t>коэф</w:t>
-      </w:r>
-      <w:proofErr w:type="spellEnd"/>
-      <w:r>
-        <w:t xml:space="preserve"> скорости = скорость СП 20 \ скорость ТПУ</w:t>
-      </w:r>
-    </w:p>
-    <w:p>
-      <w:r>
-        <w:rPr>
-          <w:lang w:val="en-US"/>
-        </w:rPr>
-        <w:t>Kl</w:t>
-      </w:r>
-      <w:r>
-        <w:t xml:space="preserve"> = </w:t>
-      </w:r>
-      <w:r>
-        <w:t xml:space="preserve">проекция реального здания \ проекция ближайшей модели из </w:t>
-      </w:r>
-      <w:proofErr w:type="spellStart"/>
-      <w:r>
-        <w:t>тпу</w:t>
-      </w:r>
-      <w:proofErr w:type="spellEnd"/>
-    </w:p>
-    <w:p>
-      <w:pPr>
-        <w:rPr>
-          <w:lang w:val="en-US"/>
-        </w:rPr>
-      </w:pPr>
-      <w:r>
-        <w:lastRenderedPageBreak/>
-        <w:t xml:space="preserve">Теперь </w:t>
-      </w:r>
-      <w:r>
-        <w:rPr>
-          <w:lang w:val="en-US"/>
-        </w:rPr>
-        <w:t>ox</w:t>
-      </w:r>
-      <w:r>
-        <w:t xml:space="preserve"> = 32.768*</w:t>
-      </w:r>
-      <w:r>
-        <w:rPr>
-          <w:lang w:val="en-US"/>
-        </w:rPr>
-        <w:t>kt</w:t>
-      </w:r>
-    </w:p>
-    <w:p/>
-    <w:p>
-      <w:pPr>
-        <w:rPr>
-          <w:lang w:val="en-US"/>
-        </w:rPr>
-      </w:pPr>
-      <w:proofErr w:type="gramStart"/>
-      <w:r>
-        <w:rPr>
-          <w:lang w:val="en-US"/>
-        </w:rPr>
-        <w:t>src.submodules</w:t>
-      </w:r>
-      <w:proofErr w:type="gramEnd"/>
-      <w:r>
-        <w:rPr>
-          <w:lang w:val="en-US"/>
-        </w:rPr>
-        <w:t>.plot.plotBuilding.PlotBuilding.summary_coefficients</w:t>
-      </w:r>
-    </w:p>
-    <w:p>
-      <w:pPr>
-        <w:rPr>
-          <w:b/>
-          <w:bCs/>
-        </w:rPr>
-      </w:pPr>
-      <w:r>
-        <w:rPr>
-          <w:b/>
-          <w:bCs/>
-        </w:rPr>
-        <w:t>Спектры</w:t>
-      </w:r>
-      <w:r>
-        <w:rPr>
-          <w:b/>
-          <w:bCs/>
-        </w:rPr>
-        <w:br/>
-      </w:r>
-    </w:p>
-    <w:p>
-      <w:r>
-        <w:t xml:space="preserve">Приходит </w:t>
-      </w:r>
-      <w:r>
-        <w:rPr>
-          <w:lang w:val="en-US"/>
-        </w:rPr>
-        <w:t>cx</w:t>
-      </w:r>
-      <w:r>
-        <w:t>\</w:t>
-      </w:r>
-      <w:proofErr w:type="gramStart"/>
-      <w:r>
-        <w:rPr>
-          <w:lang w:val="en-US"/>
-        </w:rPr>
-        <w:t>cy</w:t>
-      </w:r>
-      <w:r>
-        <w:t>(</w:t>
-      </w:r>
-      <w:proofErr w:type="gramEnd"/>
-      <w:r>
-        <w:t xml:space="preserve">любая временная функция) считаем </w:t>
-      </w:r>
-      <w:r>
-        <w:t>квадрат стандартного отклонения(дисперсия)</w:t>
-      </w:r>
-    </w:p>
-    <w:p>
       <w:r>
         <w:br/>
         <w:t xml:space="preserve">преобразование </w:t>
@@ -1542,26 +1129,10 @@
         <w:t>cy</w:t>
       </w:r>
       <w:r>
-        <w:t xml:space="preserve"> получаем спектральную плотность </w:t>
-      </w:r>
-      <w:proofErr w:type="gramStart"/>
-      <w:r>
-        <w:t>мощности(</w:t>
-      </w:r>
-      <w:proofErr w:type="gramEnd"/>
-      <w:r>
-        <w:t>СПМ)</w:t>
-      </w:r>
-    </w:p>
-    <w:p>
-      <w:r>
         <w:br/>
       </w:r>
       <w:r>
-        <w:t xml:space="preserve">умножаем полученное преобразование на </w:t>
-      </w:r>
-      <w:r>
-        <w:t>частоту (</w:t>
+        <w:t>умножаем полученное преобразование на частоту(</w:t>
       </w:r>
       <w:proofErr w:type="spellStart"/>
       <w:r>
@@ -1569,154 +1140,8 @@
       </w:r>
       <w:proofErr w:type="spellEnd"/>
       <w:r>
-        <w:t xml:space="preserve"> = таблица частоты)</w:t>
-      </w:r>
-    </w:p>
-    <w:p/>
-    <w:p>
-      <w:r>
-        <w:t>СПМ умножаем на таблицу частоты и делим на дисперсию</w:t>
-      </w:r>
-    </w:p>
-    <w:p>
-      <w:r>
-        <w:t xml:space="preserve">Получили значение по </w:t>
-      </w:r>
-      <w:r>
-        <w:rPr>
-          <w:lang w:val="en-US"/>
-        </w:rPr>
-        <w:t>OY</w:t>
-      </w:r>
-    </w:p>
-    <w:p>
-      <w:r>
-        <w:t xml:space="preserve">Рисуем в логарифмическое </w:t>
-      </w:r>
-      <w:r>
-        <w:t>шкале (</w:t>
-      </w:r>
-      <w:r>
-        <w:rPr>
-          <w:lang w:val="en-US"/>
-        </w:rPr>
-        <w:t>OX</w:t>
-      </w:r>
-      <w:r>
-        <w:t xml:space="preserve"> </w:t>
-      </w:r>
-      <w:r>
-        <w:rPr>
-          <w:lang w:val="en-US"/>
-        </w:rPr>
-        <w:t>OY</w:t>
-      </w:r>
-      <w:r>
         <w:t>)</w:t>
       </w:r>
-    </w:p>
-    <w:p>
-      <w:r>
-        <w:t xml:space="preserve">Получаем значения для </w:t>
-      </w:r>
-      <w:r>
-        <w:rPr>
-          <w:lang w:val="en-US"/>
-        </w:rPr>
-        <w:t>OX</w:t>
-      </w:r>
-    </w:p>
-    <w:p>
-      <w:r>
-        <w:t>Таблицу частоты умножаем на высоту сооружения делим референтную скорость</w:t>
-      </w:r>
-    </w:p>
-    <w:p/>
-    <w:p>
-      <w:r>
-        <w:t xml:space="preserve">Референтная </w:t>
-      </w:r>
-      <w:r>
-        <w:t xml:space="preserve">скорость </w:t>
-      </w:r>
-      <w:proofErr w:type="gramStart"/>
-      <w:r>
-        <w:t>-</w:t>
-      </w:r>
-      <w:r>
-        <w:t xml:space="preserve"> это</w:t>
-      </w:r>
-      <w:proofErr w:type="gramEnd"/>
-      <w:r>
-        <w:t xml:space="preserve"> скорость на высоте сооружения</w:t>
-      </w:r>
-    </w:p>
-    <w:p>
-      <w:r>
-        <w:rPr>
-          <w:noProof/>
-        </w:rPr>
-        <w:drawing>
-          <wp:inline distT="0" distB="0" distL="0" distR="0" wp14:anchorId="3089D38B" wp14:editId="26BB4BB3">
-            <wp:extent cx="5940425" cy="3921760"/>
-            <wp:effectExtent l="0" t="0" r="3175" b="2540"/>
-            <wp:docPr id="2" name="Рисунок 2"/>
-            <wp:cNvGraphicFramePr>
-              <a:graphicFrameLocks xmlns:a="http://schemas.openxmlformats.org/drawingml/2006/main" noChangeAspect="1"/>
-            </wp:cNvGraphicFramePr>
-            <a:graphic xmlns:a="http://schemas.openxmlformats.org/drawingml/2006/main">
-              <a:graphicData uri="http://schemas.openxmlformats.org/drawingml/2006/picture">
-                <pic:pic xmlns:pic="http://schemas.openxmlformats.org/drawingml/2006/picture">
-                  <pic:nvPicPr>
-                    <pic:cNvPr id="1" name=""/>
-                    <pic:cNvPicPr/>
-                  </pic:nvPicPr>
-                  <pic:blipFill>
-                    <a:blip r:embed="rId6"/>
-                    <a:stretch>
-                      <a:fillRect/>
-                    </a:stretch>
-                  </pic:blipFill>
-                  <pic:spPr>
-                    <a:xfrm>
-                      <a:off x="0" y="0"/>
-                      <a:ext cx="5940425" cy="3921760"/>
-                    </a:xfrm>
-                    <a:prstGeom prst="rect">
-                      <a:avLst/>
-                    </a:prstGeom>
-                  </pic:spPr>
-                </pic:pic>
-              </a:graphicData>
-            </a:graphic>
-          </wp:inline>
-        </w:drawing>
-      </w:r>
-    </w:p>
-    <w:p/>
-    <w:p>
-      <w:pPr>
-        <w:rPr>
-          <w:lang w:val="en-US"/>
-        </w:rPr>
-      </w:pPr>
-      <w:proofErr w:type="spellStart"/>
-      <w:proofErr w:type="gramStart"/>
-      <w:r>
-        <w:rPr>
-          <w:lang w:val="en-US"/>
-        </w:rPr>
-        <w:lastRenderedPageBreak/>
-        <w:t>src.submodules</w:t>
-      </w:r>
-      <w:proofErr w:type="gramEnd"/>
-      <w:r>
-        <w:rPr>
-          <w:lang w:val="en-US"/>
-        </w:rPr>
-        <w:t>.plot.plotBuilding.PlotBuilding.welch_graph</w:t>
-      </w:r>
-      <w:proofErr w:type="spellEnd"/>
     </w:p>
     <w:sectPr>
       <w:pgSz w:w="11906" w:h="16838"/>
@@ -2450,16 +1875,4 @@
     </a:ext>
   </a:extLst>
 </a:theme>
-</file>
-
-<file path=customXml/item1.xml><?xml version="1.0" encoding="utf-8"?>
-<b:Sources xmlns:b="http://schemas.openxmlformats.org/officeDocument/2006/bibliography" xmlns="http://schemas.openxmlformats.org/officeDocument/2006/bibliography" SelectedStyle="\APASixthEditionOfficeOnline.xsl" StyleName="APA" Version="6"/>
-</file>
-
-<file path=customXml/itemProps1.xml><?xml version="1.0" encoding="utf-8"?>
-<ds:datastoreItem xmlns:ds="http://schemas.openxmlformats.org/officeDocument/2006/customXml" ds:itemID="{B08828BA-A051-4117-8E34-680BB6A4F2A6}">
-  <ds:schemaRefs>
-    <ds:schemaRef ds:uri="http://schemas.openxmlformats.org/officeDocument/2006/bibliography"/>
-  </ds:schemaRefs>
-</ds:datastoreItem>
 </file>
</xml_diff>